<commit_message>
Added data folder with all ratings (we can later pull them dorectly), installed some packages through renv
</commit_message>
<xml_diff>
--- a/_book/Comparing-LLM-and-human-peer-reviews-and-ratings-of-social-science-research-using-data-from-Unjournal.org-evaluations.docx
+++ b/_book/Comparing-LLM-and-human-peer-reviews-and-ratings-of-social-science-research-using-data-from-Unjournal.org-evaluations.docx
@@ -139,7 +139,7 @@
         <w:pStyle w:val="Date"/>
       </w:pPr>
       <w:r>
-        <w:t xml:space="preserve">2025-08-30</w:t>
+        <w:t xml:space="preserve">2025-09-06</w:t>
       </w:r>
     </w:p>
     <w:p>
@@ -430,7 +430,7 @@
         </w:p>
       </w:sdtContent>
     </w:sdt>
-    <w:bookmarkStart w:id="24" w:name="project-overview"/>
+    <w:bookmarkStart w:id="25" w:name="project-overview"/>
     <w:p>
       <w:pPr>
         <w:pStyle w:val="Heading1"/>
@@ -555,12 +555,57 @@
         </w:tc>
       </w:tr>
     </w:tbl>
+    <w:bookmarkStart w:id="23" w:name="motivation-and-questions"/>
     <w:p>
       <w:pPr>
-        <w:pStyle w:val="BodyText"/>
+        <w:pStyle w:val="Heading2"/>
       </w:pPr>
       <w:r>
-        <w:t xml:space="preserve">Motivation and questions</w:t>
+        <w:t xml:space="preserve">1.1 Motivation and questions</w:t>
+      </w:r>
+    </w:p>
+    <w:p>
+      <w:pPr>
+        <w:pStyle w:val="FirstParagraph"/>
+      </w:pPr>
+      <w:r>
+        <w:t xml:space="preserve">Is AI good at peer-reviewing? Does it offer useful and valid feedback? Can it predict how human experts will rate research across a range of categories? How can it help academics do this</w:t>
+      </w:r>
+      <w:r>
+        <w:t xml:space="preserve"> </w:t>
+      </w:r>
+      <w:r>
+        <w:t xml:space="preserve">“</w:t>
+      </w:r>
+      <w:r>
+        <w:t xml:space="preserve">thankless</w:t>
+      </w:r>
+      <w:r>
+        <w:t xml:space="preserve">”</w:t>
+      </w:r>
+      <w:r>
+        <w:t xml:space="preserve"> </w:t>
+      </w:r>
+      <w:r>
+        <w:t xml:space="preserve">task better? Is it particularly good at spotting errors? Are there specific categories, e.g. spotting math errors or judging real-world relevance, where it does surprisingly well or poorly? How does its</w:t>
+      </w:r>
+      <w:r>
+        <w:t xml:space="preserve"> </w:t>
+      </w:r>
+      <w:r>
+        <w:t xml:space="preserve">“</w:t>
+      </w:r>
+      <w:r>
+        <w:t xml:space="preserve">research taste</w:t>
+      </w:r>
+      <w:r>
+        <w:t xml:space="preserve">”</w:t>
+      </w:r>
+      <w:r>
+        <w:t xml:space="preserve"> </w:t>
+      </w:r>
+      <w:r>
+        <w:t xml:space="preserve">compare to humans?</w:t>
       </w:r>
     </w:p>
     <w:p>
@@ -568,25 +613,24 @@
         <w:pStyle w:val="BodyText"/>
       </w:pPr>
       <w:r>
-        <w:t xml:space="preserve">Is AI good at peer-reviewing? Does it offer useful feedback? Can it predict how human experts will rate research across a range of categories? Where does it do surprisingly well (e.g., catching math errors) or poorly (e.g., judging real-world relevance)? What does its</w:t>
-      </w:r>
-      <w:r>
-        <w:t xml:space="preserve"> </w:t>
-      </w:r>
-      <w:r>
-        <w:t xml:space="preserve">“</w:t>
-      </w:r>
-      <w:r>
-        <w:t xml:space="preserve">research taste</w:t>
-      </w:r>
-      <w:r>
-        <w:t xml:space="preserve">”</w:t>
-      </w:r>
-      <w:r>
-        <w:t xml:space="preserve"> </w:t>
-      </w:r>
-      <w:r>
-        <w:t xml:space="preserve">look like compared to humans?</w:t>
+        <w:t xml:space="preserve">If AI research-evaluation works it could free up a lot of scientific resources – perhaps $1.5 billion/year in the US alone (</w:t>
+      </w:r>
+      <w:r>
+        <w:t xml:space="preserve">Aczel, Szaszi, and Holcombe (</w:t>
+      </w:r>
+      <w:hyperlink w:anchor="ref-aczel2021billion">
+        <w:r>
+          <w:rPr>
+            <w:rStyle w:val="Hyperlink"/>
+          </w:rPr>
+          <w:t xml:space="preserve">2021</w:t>
+        </w:r>
+      </w:hyperlink>
+      <w:r>
+        <w:t xml:space="preserve">)</w:t>
+      </w:r>
+      <w:r>
+        <w:t xml:space="preserve">)) – and offer more continual and detailed review, helping improve research. It could also help characterize methodological strengths/weaknesses across papers, aiding training and research direction-setting. Furthermore, a key promise of AI is to directly improve science and research. Understanding how AI engages with research evaluations may provide a window into its values, abilities, and limitations.</w:t>
       </w:r>
     </w:p>
     <w:p>
@@ -594,7 +638,40 @@
         <w:pStyle w:val="BodyText"/>
       </w:pPr>
       <w:r>
-        <w:t xml:space="preserve">If AI research evaluation works, it could free up substantial scientific resources (potentially on the order of billions of dollars annually) and enable more continual, structured feedback on research. It could also help characterize methodological strengths/weaknesses across papers, aiding training and research direction-setting. Understanding how AI evaluates research is also a window into its values, abilities, and limitations.</w:t>
+        <w:t xml:space="preserve">In this project, we are testing the capabilities of current large language models (LLMs), illustrating whether they can generate research paper evaluations comparable to expert human reviews. The Unjournal systematically prioritizes</w:t>
+      </w:r>
+      <w:r>
+        <w:t xml:space="preserve"> </w:t>
+      </w:r>
+      <w:r>
+        <w:t xml:space="preserve">‘</w:t>
+      </w:r>
+      <w:r>
+        <w:t xml:space="preserve">impactful</w:t>
+      </w:r>
+      <w:r>
+        <w:t xml:space="preserve">’</w:t>
+      </w:r>
+      <w:r>
+        <w:t xml:space="preserve"> </w:t>
+      </w:r>
+      <w:r>
+        <w:t xml:space="preserve">research and pays for high-quality human evaluations, structured quantified ratings, claim identification and assessment, and predictions. In this project, we use an AI (OpenAI’s</w:t>
+      </w:r>
+      <w:r>
+        <w:t xml:space="preserve"> </w:t>
+      </w:r>
+      <w:r>
+        <w:rPr>
+          <w:rStyle w:val="VerbatimChar"/>
+        </w:rPr>
+        <w:t xml:space="preserve">GPT-5</w:t>
+      </w:r>
+      <w:r>
+        <w:t xml:space="preserve"> </w:t>
+      </w:r>
+      <w:r>
+        <w:t xml:space="preserve">model for now) to review social science research papers under the same criteria used by human reviewers for The Unjournal.</w:t>
       </w:r>
     </w:p>
     <w:p>
@@ -602,40 +679,7 @@
         <w:pStyle w:val="BodyText"/>
       </w:pPr>
       <w:r>
-        <w:t xml:space="preserve">In this project, we are testing the capabilities of current large language models (LLMs), illustrating whether they can generate research paper evaluations comparable to expert human reviews. The Unjournal systematically prioritizes</w:t>
-      </w:r>
-      <w:r>
-        <w:t xml:space="preserve"> </w:t>
-      </w:r>
-      <w:r>
-        <w:t xml:space="preserve">‘</w:t>
-      </w:r>
-      <w:r>
-        <w:t xml:space="preserve">impactful</w:t>
-      </w:r>
-      <w:r>
-        <w:t xml:space="preserve">’</w:t>
-      </w:r>
-      <w:r>
-        <w:t xml:space="preserve"> </w:t>
-      </w:r>
-      <w:r>
-        <w:t xml:space="preserve">research and pays for high-quality human evaluations, structured quantified ratings, claim identification and assessment, and predictions. In this project, we use an AI (OpenAI’s</w:t>
-      </w:r>
-      <w:r>
-        <w:t xml:space="preserve"> </w:t>
-      </w:r>
-      <w:r>
-        <w:rPr>
-          <w:rStyle w:val="VerbatimChar"/>
-        </w:rPr>
-        <w:t xml:space="preserve">GPT-5</w:t>
-      </w:r>
-      <w:r>
-        <w:t xml:space="preserve"> </w:t>
-      </w:r>
-      <w:r>
-        <w:t xml:space="preserve">model for now) to review social science research papers under the same criteria used by human reviewers for The Unjournal.</w:t>
+        <w:t xml:space="preserve">Each paper is assessed on specific dimensions – for example, the strength of its evidence, rigor of methods, clarity of communication, openness/reproducibility, relevance to global priorities, and overall quality. The LLM will provide quantitative scores (with uncertainty intervals) on these criteria and produce a written evaluation</w:t>
       </w:r>
     </w:p>
     <w:p>
@@ -643,7 +687,7 @@
         <w:pStyle w:val="BodyText"/>
       </w:pPr>
       <w:r>
-        <w:t xml:space="preserve">Each paper is assessed on specific dimensions – for example, the strength of its evidence, rigor of methods, clarity of communication, openness/reproducibility, relevance to global priorities, and overall quality. The LLM will provide quantitative scores (with uncertainty intervals) on these criteria and produce a written evaluation</w:t>
+        <w:t xml:space="preserve">Our initial dataset will include research papers that have existing human evaluations. For each paper, the AI will generate: (1) numeric ratings on the defined criteria, (2) identification of the paper’s key claims, and (3) a detailed review discussing the paper’s contributions and weaknesses. We will then compare the AI-generated evaluations to the published human evaluations.</w:t>
       </w:r>
     </w:p>
     <w:p>
@@ -651,24 +695,17 @@
         <w:pStyle w:val="BodyText"/>
       </w:pPr>
       <w:r>
-        <w:t xml:space="preserve">Our initial dataset will include research papers that have existing human evaluations. For each paper, the AI will generate: (1) numeric ratings on the defined criteria, (2) identification of the paper’s key claims, and (3) a detailed review discussing the paper’s contributions and weaknesses. We will then compare the AI-generated evaluations to the published human evaluations.</w:t>
+        <w:t xml:space="preserve">Next, we will focus on papers currently under evaluation, ie where no human evaluation exists yet and we can rule out any contamination.</w:t>
       </w:r>
     </w:p>
-    <w:p>
-      <w:pPr>
-        <w:pStyle w:val="BodyText"/>
-      </w:pPr>
-      <w:r>
-        <w:t xml:space="preserve">Next, we will focus on papers currently under evaluation, ie where no human evaluation exists yet and we can rule out any contamination.</w:t>
-      </w:r>
-    </w:p>
-    <w:bookmarkStart w:id="23" w:name="related-work"/>
+    <w:bookmarkEnd w:id="23"/>
+    <w:bookmarkStart w:id="24" w:name="related-work"/>
     <w:p>
       <w:pPr>
         <w:pStyle w:val="Heading2"/>
       </w:pPr>
       <w:r>
-        <w:t xml:space="preserve">1.1 Related work</w:t>
+        <w:t xml:space="preserve">1.2 Related work</w:t>
       </w:r>
     </w:p>
     <w:p>
@@ -769,9 +806,9 @@
         <w:pStyle w:val="BodyText"/>
       </w:pPr>
     </w:p>
-    <w:bookmarkEnd w:id="23"/>
     <w:bookmarkEnd w:id="24"/>
-    <w:bookmarkStart w:id="25" w:name="numerical-ratings"/>
+    <w:bookmarkEnd w:id="25"/>
+    <w:bookmarkStart w:id="26" w:name="numerical-ratings"/>
     <w:p>
       <w:pPr>
         <w:pStyle w:val="Heading1"/>
@@ -908,8 +945,8 @@
         </w:pict>
       </w:r>
     </w:p>
-    <w:bookmarkEnd w:id="25"/>
-    <w:bookmarkStart w:id="52" w:name="llm-vs.-human-ratings"/>
+    <w:bookmarkEnd w:id="26"/>
+    <w:bookmarkStart w:id="53" w:name="llm-vs.-human-ratings"/>
     <w:p>
       <w:pPr>
         <w:pStyle w:val="Heading1"/>
@@ -918,7 +955,7 @@
         <w:t xml:space="preserve">3. LLM vs. Human Ratings</w:t>
       </w:r>
     </w:p>
-    <w:bookmarkStart w:id="28" w:name="overview"/>
+    <w:bookmarkStart w:id="29" w:name="overview"/>
     <w:p>
       <w:pPr>
         <w:pStyle w:val="Heading2"/>
@@ -943,7 +980,7 @@
       <w:r>
         <w:t xml:space="preserve">) from the</w:t>
       </w:r>
-      <w:hyperlink r:id="rId26">
+      <w:hyperlink r:id="rId27">
         <w:r>
           <w:rPr>
             <w:rStyle w:val="Hyperlink"/>
@@ -960,7 +997,7 @@
       <w:r>
         <w:t xml:space="preserve"> </w:t>
       </w:r>
-      <w:hyperlink r:id="rId27">
+      <w:hyperlink r:id="rId28">
         <w:r>
           <w:rPr>
             <w:rStyle w:val="Hyperlink"/>
@@ -985,8 +1022,8 @@
         <w:t xml:space="preserve">, and (iii) summarize agreement using distributional views and reliability statistics.</w:t>
       </w:r>
     </w:p>
-    <w:bookmarkEnd w:id="28"/>
-    <w:bookmarkStart w:id="29" w:name="data-harmonization"/>
+    <w:bookmarkEnd w:id="29"/>
+    <w:bookmarkStart w:id="30" w:name="data-harmonization"/>
     <w:p>
       <w:pPr>
         <w:pStyle w:val="Heading2"/>
@@ -1157,8 +1194,8 @@
         <w:t xml:space="preserve">Uncertainty fields. Where available, we carry lower/upper bounds for both LLM and humans; these are used in optional uncertainty checks but do not affect the mid‑point comparisons below.</w:t>
       </w:r>
     </w:p>
-    <w:bookmarkEnd w:id="29"/>
-    <w:bookmarkStart w:id="37" w:name="distribution-of-ratings"/>
+    <w:bookmarkEnd w:id="30"/>
+    <w:bookmarkStart w:id="38" w:name="distribution-of-ratings"/>
     <w:p>
       <w:pPr>
         <w:pStyle w:val="Heading2"/>
@@ -1181,7 +1218,7 @@
       <w:tr>
         <w:tc>
           <w:tcPr/>
-          <w:bookmarkStart w:id="32" w:name="fig-scatter-ellipses"/>
+          <w:bookmarkStart w:id="33" w:name="fig-scatter-ellipses"/>
           <w:tbl>
             <w:tblPr>
               <w:tblStyle w:val="Table"/>
@@ -1196,7 +1233,7 @@
             <w:tr>
               <w:tc>
                 <w:tcPr/>
-                <w:bookmarkStart w:id="30" w:name="fig-scatter-ellipses-1"/>
+                <w:bookmarkStart w:id="31" w:name="fig-scatter-ellipses-1"/>
                 <w:p>
                   <w:pPr>
                     <w:pStyle w:val="SourceCode"/>
@@ -1224,7 +1261,7 @@
                     <w:t xml:space="preserve">(a) LLM vs Human with robust CI ellipses. Horizontal span covers the union of all human raters’ CIs and point ratings; vertical span from LLM CI. Centers at midpoints. Dropdown selects metric.</w:t>
                   </w:r>
                 </w:p>
-                <w:bookmarkEnd w:id="30"/>
+                <w:bookmarkEnd w:id="31"/>
               </w:tc>
             </w:tr>
           </w:tbl>
@@ -1250,7 +1287,7 @@
             <w:tr>
               <w:tc>
                 <w:tcPr/>
-                <w:bookmarkStart w:id="31" w:name="fig-scatter-ellipses-2"/>
+                <w:bookmarkStart w:id="32" w:name="fig-scatter-ellipses-2"/>
                 <w:p>
                   <w:pPr>
                     <w:pStyle w:val="SourceCode"/>
@@ -1278,7 +1315,7 @@
                     <w:t xml:space="preserve">(b)</w:t>
                   </w:r>
                 </w:p>
-                <w:bookmarkEnd w:id="31"/>
+                <w:bookmarkEnd w:id="32"/>
               </w:tc>
             </w:tr>
           </w:tbl>
@@ -1295,7 +1332,7 @@
               <w:t xml:space="preserve">Figure 3.1</w:t>
             </w:r>
           </w:p>
-          <w:bookmarkEnd w:id="32"/>
+          <w:bookmarkEnd w:id="33"/>
         </w:tc>
       </w:tr>
     </w:tbl>
@@ -1398,7 +1435,7 @@
       <w:tr>
         <w:tc>
           <w:tcPr/>
-          <w:bookmarkStart w:id="36" w:name="fig-hist-static"/>
+          <w:bookmarkStart w:id="37" w:name="fig-hist-static"/>
           <w:p>
             <w:pPr>
               <w:pStyle w:val="Compact"/>
@@ -1409,18 +1446,18 @@
                 <wp:inline>
                   <wp:extent cx="5334000" cy="4574318"/>
                   <wp:effectExtent b="0" l="0" r="0" t="0"/>
-                  <wp:docPr descr="" title="" id="34" name="Picture"/>
+                  <wp:docPr descr="" title="" id="35" name="Picture"/>
                   <a:graphic>
                     <a:graphicData uri="http://schemas.openxmlformats.org/drawingml/2006/picture">
                       <pic:pic>
                         <pic:nvPicPr>
-                          <pic:cNvPr descr="compare_ratings_files/figure-docx/fig-hist-static-output-1.png" id="35" name="Picture"/>
+                          <pic:cNvPr descr="compare_ratings_files/figure-docx/fig-hist-static-output-1.png" id="36" name="Picture"/>
                           <pic:cNvPicPr>
                             <a:picLocks noChangeArrowheads="1" noChangeAspect="1"/>
                           </pic:cNvPicPr>
                         </pic:nvPicPr>
                         <pic:blipFill>
-                          <a:blip r:embed="rId33"/>
+                          <a:blip r:embed="rId34"/>
                           <a:stretch>
                             <a:fillRect/>
                           </a:stretch>
@@ -1460,12 +1497,12 @@
               <w:t xml:space="preserve">Figure 3.2: Distributions by metric. Top: Overall (full width). Bottom: remaining metrics in a 2×3 grid.</w:t>
             </w:r>
           </w:p>
-          <w:bookmarkEnd w:id="36"/>
+          <w:bookmarkEnd w:id="37"/>
         </w:tc>
       </w:tr>
     </w:tbl>
-    <w:bookmarkEnd w:id="37"/>
-    <w:bookmarkStart w:id="42" w:name="differences-by-paper-and-metric"/>
+    <w:bookmarkEnd w:id="38"/>
+    <w:bookmarkStart w:id="43" w:name="differences-by-paper-and-metric"/>
     <w:p>
       <w:pPr>
         <w:pStyle w:val="Heading2"/>
@@ -1565,7 +1602,7 @@
       <w:tr>
         <w:tc>
           <w:tcPr/>
-          <w:bookmarkStart w:id="41" w:name="fig-heatmap-static"/>
+          <w:bookmarkStart w:id="42" w:name="fig-heatmap-static"/>
           <w:p>
             <w:pPr>
               <w:pStyle w:val="Compact"/>
@@ -1576,18 +1613,18 @@
                 <wp:inline>
                   <wp:extent cx="5334000" cy="8019060"/>
                   <wp:effectExtent b="0" l="0" r="0" t="0"/>
-                  <wp:docPr descr="" title="" id="39" name="Picture"/>
+                  <wp:docPr descr="" title="" id="40" name="Picture"/>
                   <a:graphic>
                     <a:graphicData uri="http://schemas.openxmlformats.org/drawingml/2006/picture">
                       <pic:pic>
                         <pic:nvPicPr>
-                          <pic:cNvPr descr="compare_ratings_files/figure-docx/fig-heatmap-static-output-1.png" id="40" name="Picture"/>
+                          <pic:cNvPr descr="compare_ratings_files/figure-docx/fig-heatmap-static-output-1.png" id="41" name="Picture"/>
                           <pic:cNvPicPr>
                             <a:picLocks noChangeArrowheads="1" noChangeAspect="1"/>
                           </pic:cNvPicPr>
                         </pic:nvPicPr>
                         <pic:blipFill>
-                          <a:blip r:embed="rId38"/>
+                          <a:blip r:embed="rId39"/>
                           <a:stretch>
                             <a:fillRect/>
                           </a:stretch>
@@ -1627,12 +1664,12 @@
               <w:t xml:space="preserve">Figure 3.3: LLM − Human difference by paper × metric (robust, centered scale; rows sorted by signed overall difference).</w:t>
             </w:r>
           </w:p>
-          <w:bookmarkEnd w:id="41"/>
+          <w:bookmarkEnd w:id="42"/>
         </w:tc>
       </w:tr>
     </w:tbl>
-    <w:bookmarkEnd w:id="42"/>
-    <w:bookmarkStart w:id="51" w:name="agreement-metrics"/>
+    <w:bookmarkEnd w:id="43"/>
+    <w:bookmarkStart w:id="52" w:name="agreement-metrics"/>
     <w:p>
       <w:pPr>
         <w:pStyle w:val="Heading2"/>
@@ -1776,7 +1813,7 @@
       <w:tr>
         <w:tc>
           <w:tcPr/>
-          <w:bookmarkStart w:id="43" w:name="tbl-agreement"/>
+          <w:bookmarkStart w:id="44" w:name="tbl-agreement"/>
           <w:p>
             <w:pPr>
               <w:jc w:val="center"/>
@@ -2759,7 +2796,7 @@
               </w:tc>
             </w:tr>
           </w:tbl>
-          <w:bookmarkEnd w:id="43"/>
+          <w:bookmarkEnd w:id="44"/>
           <w:p/>
         </w:tc>
       </w:tr>
@@ -2786,7 +2823,7 @@
       <w:tr>
         <w:tc>
           <w:tcPr/>
-          <w:bookmarkStart w:id="44" w:name="tbl-calibration"/>
+          <w:bookmarkStart w:id="45" w:name="tbl-calibration"/>
           <w:p>
             <w:pPr>
               <w:jc w:val="center"/>
@@ -3769,7 +3806,7 @@
               </w:tc>
             </w:tr>
           </w:tbl>
-          <w:bookmarkEnd w:id="44"/>
+          <w:bookmarkEnd w:id="45"/>
           <w:p/>
         </w:tc>
       </w:tr>
@@ -3796,7 +3833,7 @@
       <w:tr>
         <w:tc>
           <w:tcPr/>
-          <w:bookmarkStart w:id="45" w:name="tbl-coverage"/>
+          <w:bookmarkStart w:id="46" w:name="tbl-coverage"/>
           <w:p>
             <w:pPr>
               <w:jc w:val="center"/>
@@ -4464,7 +4501,7 @@
               </w:tc>
             </w:tr>
           </w:tbl>
-          <w:bookmarkEnd w:id="45"/>
+          <w:bookmarkEnd w:id="46"/>
           <w:p/>
         </w:tc>
       </w:tr>
@@ -4483,7 +4520,7 @@
       <w:tr>
         <w:tc>
           <w:tcPr/>
-          <w:bookmarkStart w:id="49" w:name="fig-uncert-vs-error"/>
+          <w:bookmarkStart w:id="50" w:name="fig-uncert-vs-error"/>
           <w:p>
             <w:pPr>
               <w:pStyle w:val="Compact"/>
@@ -4494,18 +4531,18 @@
                 <wp:inline>
                   <wp:extent cx="5334000" cy="3940300"/>
                   <wp:effectExtent b="0" l="0" r="0" t="0"/>
-                  <wp:docPr descr="" title="" id="47" name="Picture"/>
+                  <wp:docPr descr="" title="" id="48" name="Picture"/>
                   <a:graphic>
                     <a:graphicData uri="http://schemas.openxmlformats.org/drawingml/2006/picture">
                       <pic:pic>
                         <pic:nvPicPr>
-                          <pic:cNvPr descr="compare_ratings_files/figure-docx/fig-uncert-vs-error-output-1.png" id="48" name="Picture"/>
+                          <pic:cNvPr descr="compare_ratings_files/figure-docx/fig-uncert-vs-error-output-1.png" id="49" name="Picture"/>
                           <pic:cNvPicPr>
                             <a:picLocks noChangeArrowheads="1" noChangeAspect="1"/>
                           </pic:cNvPicPr>
                         </pic:nvPicPr>
                         <pic:blipFill>
-                          <a:blip r:embed="rId46"/>
+                          <a:blip r:embed="rId47"/>
                           <a:stretch>
                             <a:fillRect/>
                           </a:stretch>
@@ -4545,7 +4582,7 @@
               <w:t xml:space="preserve">Figure 3.4: Human uncertainty (CI width) vs |LLM − Human|. Spearman correlation reported.</w:t>
             </w:r>
           </w:p>
-          <w:bookmarkEnd w:id="49"/>
+          <w:bookmarkEnd w:id="50"/>
         </w:tc>
       </w:tr>
     </w:tbl>
@@ -4563,7 +4600,7 @@
       <w:tr>
         <w:tc>
           <w:tcPr/>
-          <w:bookmarkStart w:id="50" w:name="tbl-outliers"/>
+          <w:bookmarkStart w:id="51" w:name="tbl-outliers"/>
           <w:p>
             <w:pPr>
               <w:jc w:val="center"/>
@@ -6289,14 +6326,14 @@
               </w:tc>
             </w:tr>
           </w:tbl>
-          <w:bookmarkEnd w:id="50"/>
+          <w:bookmarkEnd w:id="51"/>
           <w:p/>
         </w:tc>
       </w:tr>
     </w:tbl>
-    <w:bookmarkEnd w:id="51"/>
     <w:bookmarkEnd w:id="52"/>
-    <w:bookmarkStart w:id="60" w:name="references"/>
+    <w:bookmarkEnd w:id="53"/>
+    <w:bookmarkStart w:id="62" w:name="references"/>
     <w:p>
       <w:pPr>
         <w:pStyle w:val="Heading1"/>
@@ -6305,13 +6342,42 @@
         <w:t xml:space="preserve">References</w:t>
       </w:r>
     </w:p>
-    <w:bookmarkStart w:id="59" w:name="refs"/>
-    <w:bookmarkStart w:id="54" w:name="ref-eger2025"/>
+    <w:bookmarkStart w:id="61" w:name="refs"/>
+    <w:bookmarkStart w:id="54" w:name="ref-aczel2021billion"/>
     <w:p>
       <w:pPr>
         <w:pStyle w:val="Bibliography"/>
       </w:pPr>
       <w:r>
+        <w:t xml:space="preserve">Aczel, Balazs, Barnabas Szaszi, and Alex O Holcombe,</w:t>
+      </w:r>
+      <w:r>
+        <w:t xml:space="preserve"> </w:t>
+      </w:r>
+      <w:r>
+        <w:t xml:space="preserve">“A billion-dollar donation: Estimating the cost of researchers’ time spent on peer review,”</w:t>
+      </w:r>
+      <w:r>
+        <w:t xml:space="preserve"> </w:t>
+      </w:r>
+      <w:r>
+        <w:rPr>
+          <w:iCs/>
+          <w:i/>
+        </w:rPr>
+        <w:t xml:space="preserve">Research integrity and peer review</w:t>
+      </w:r>
+      <w:r>
+        <w:t xml:space="preserve">, 6 (2021), 1–8 (Springer).</w:t>
+      </w:r>
+    </w:p>
+    <w:bookmarkEnd w:id="54"/>
+    <w:bookmarkStart w:id="56" w:name="ref-eger2025"/>
+    <w:p>
+      <w:pPr>
+        <w:pStyle w:val="Bibliography"/>
+      </w:pPr>
+      <w:r>
         <w:t xml:space="preserve">Eger, Steffen, Yong Cao, Jennifer D’Souza, Andreas Geiger, Christian Greisinger, Stephanie Gross, Yufang Hou, Brigitte Krenn, Anne Lauscher, Yizhi Li, Chenghua Lin, Nafise Sadat Moosavi, Wei Zhao, and Tristan Miller,</w:t>
       </w:r>
       <w:r>
@@ -6320,7 +6386,7 @@
       <w:r>
         <w:t xml:space="preserve">“</w:t>
       </w:r>
-      <w:hyperlink r:id="rId53">
+      <w:hyperlink r:id="rId55">
         <w:r>
           <w:rPr>
             <w:rStyle w:val="Hyperlink"/>
@@ -6345,8 +6411,8 @@
         <w:t xml:space="preserve">, (2025).</w:t>
       </w:r>
     </w:p>
-    <w:bookmarkEnd w:id="54"/>
-    <w:bookmarkStart w:id="56" w:name="ref-Luo2025"/>
+    <w:bookmarkEnd w:id="56"/>
+    <w:bookmarkStart w:id="58" w:name="ref-Luo2025"/>
     <w:p>
       <w:pPr>
         <w:pStyle w:val="Bibliography"/>
@@ -6360,7 +6426,7 @@
       <w:r>
         <w:t xml:space="preserve">“</w:t>
       </w:r>
-      <w:hyperlink r:id="rId55">
+      <w:hyperlink r:id="rId57">
         <w:r>
           <w:rPr>
             <w:rStyle w:val="Hyperlink"/>
@@ -6385,8 +6451,8 @@
         <w:t xml:space="preserve">, (2025).</w:t>
       </w:r>
     </w:p>
-    <w:bookmarkEnd w:id="56"/>
-    <w:bookmarkStart w:id="58" w:name="ref-Zhang2025"/>
+    <w:bookmarkEnd w:id="58"/>
+    <w:bookmarkStart w:id="60" w:name="ref-Zhang2025"/>
     <w:p>
       <w:pPr>
         <w:pStyle w:val="Bibliography"/>
@@ -6400,7 +6466,7 @@
       <w:r>
         <w:t xml:space="preserve">“</w:t>
       </w:r>
-      <w:hyperlink r:id="rId57">
+      <w:hyperlink r:id="rId59">
         <w:r>
           <w:rPr>
             <w:rStyle w:val="Hyperlink"/>
@@ -6425,9 +6491,9 @@
         <w:t xml:space="preserve">, (2025).</w:t>
       </w:r>
     </w:p>
-    <w:bookmarkEnd w:id="58"/>
-    <w:bookmarkEnd w:id="59"/>
     <w:bookmarkEnd w:id="60"/>
+    <w:bookmarkEnd w:id="61"/>
+    <w:bookmarkEnd w:id="62"/>
     <w:sectPr/>
   </w:body>
 </w:document>

</xml_diff>